<commit_message>
incluido link do video de apresentação no relatorio do desafio principal
</commit_message>
<xml_diff>
--- a/Relatorio_Tecnico_Tech_Challenge_Fase1_v1.docx
+++ b/Relatorio_Tecnico_Tech_Challenge_Fase1_v1.docx
@@ -9,7 +9,6 @@
         <w:keepLines w:val="false"/>
         <w:pageBreakBefore w:val="false"/>
         <w:widowControl/>
-        <w:pBdr/>
         <w:shd w:val="clear" w:fill="auto"/>
         <w:spacing w:lineRule="auto" w:line="360" w:before="0" w:after="0"/>
         <w:ind w:hanging="0" w:start="0" w:end="0"/>
@@ -86,7 +85,6 @@
         <w:keepLines w:val="false"/>
         <w:pageBreakBefore w:val="false"/>
         <w:widowControl/>
-        <w:pBdr/>
         <w:shd w:val="clear" w:fill="auto"/>
         <w:spacing w:lineRule="auto" w:line="360" w:before="4200" w:after="0"/>
         <w:ind w:hanging="0" w:start="0" w:end="0"/>
@@ -160,7 +158,6 @@
         <w:keepLines w:val="false"/>
         <w:pageBreakBefore w:val="false"/>
         <w:widowControl/>
-        <w:pBdr/>
         <w:shd w:val="clear" w:fill="auto"/>
         <w:spacing w:lineRule="auto" w:line="360" w:before="360" w:after="0"/>
         <w:ind w:hanging="0" w:start="0" w:end="0"/>
@@ -213,7 +210,6 @@
         <w:keepLines w:val="false"/>
         <w:pageBreakBefore w:val="false"/>
         <w:widowControl/>
-        <w:pBdr/>
         <w:shd w:val="clear" w:fill="auto"/>
         <w:spacing w:lineRule="auto" w:line="360" w:before="0" w:after="0"/>
         <w:ind w:hanging="0" w:start="0" w:end="0"/>
@@ -231,7 +227,6 @@
         <w:keepLines w:val="false"/>
         <w:pageBreakBefore w:val="false"/>
         <w:widowControl/>
-        <w:pBdr/>
         <w:shd w:val="clear" w:fill="auto"/>
         <w:spacing w:lineRule="auto" w:line="360" w:before="0" w:after="0"/>
         <w:ind w:hanging="0" w:start="0" w:end="0"/>
@@ -249,7 +244,6 @@
         <w:keepLines w:val="false"/>
         <w:pageBreakBefore w:val="false"/>
         <w:widowControl/>
-        <w:pBdr/>
         <w:shd w:val="clear" w:fill="auto"/>
         <w:spacing w:lineRule="auto" w:line="360" w:before="0" w:after="0"/>
         <w:ind w:hanging="0" w:start="0" w:end="0"/>
@@ -267,7 +261,6 @@
         <w:keepLines w:val="false"/>
         <w:pageBreakBefore w:val="false"/>
         <w:widowControl/>
-        <w:pBdr/>
         <w:shd w:val="clear" w:fill="auto"/>
         <w:spacing w:lineRule="auto" w:line="360" w:before="0" w:after="0"/>
         <w:ind w:hanging="0" w:start="0" w:end="0"/>
@@ -285,7 +278,6 @@
         <w:keepLines w:val="false"/>
         <w:pageBreakBefore w:val="false"/>
         <w:widowControl/>
-        <w:pBdr/>
         <w:shd w:val="clear" w:fill="auto"/>
         <w:spacing w:lineRule="auto" w:line="360" w:before="0" w:after="0"/>
         <w:ind w:hanging="0" w:start="0" w:end="0"/>
@@ -303,7 +295,6 @@
         <w:keepLines w:val="false"/>
         <w:pageBreakBefore w:val="false"/>
         <w:widowControl/>
-        <w:pBdr/>
         <w:shd w:val="clear" w:fill="auto"/>
         <w:spacing w:lineRule="auto" w:line="360" w:before="0" w:after="0"/>
         <w:ind w:hanging="0" w:start="0" w:end="0"/>
@@ -321,7 +312,6 @@
         <w:keepLines w:val="false"/>
         <w:pageBreakBefore w:val="false"/>
         <w:widowControl/>
-        <w:pBdr/>
         <w:shd w:val="clear" w:fill="auto"/>
         <w:spacing w:lineRule="auto" w:line="360" w:before="0" w:after="0"/>
         <w:ind w:hanging="0" w:start="0" w:end="0"/>
@@ -339,7 +329,6 @@
         <w:keepLines w:val="false"/>
         <w:pageBreakBefore w:val="false"/>
         <w:widowControl/>
-        <w:pBdr/>
         <w:shd w:val="clear" w:fill="auto"/>
         <w:spacing w:lineRule="auto" w:line="360" w:before="0" w:after="0"/>
         <w:ind w:hanging="0" w:start="0" w:end="0"/>
@@ -357,7 +346,6 @@
         <w:keepLines w:val="false"/>
         <w:pageBreakBefore w:val="false"/>
         <w:widowControl/>
-        <w:pBdr/>
         <w:shd w:val="clear" w:fill="auto"/>
         <w:spacing w:lineRule="auto" w:line="360" w:before="0" w:after="0"/>
         <w:ind w:hanging="0" w:start="0" w:end="0"/>
@@ -375,7 +363,6 @@
         <w:keepLines w:val="false"/>
         <w:pageBreakBefore w:val="false"/>
         <w:widowControl/>
-        <w:pBdr/>
         <w:shd w:val="clear" w:fill="auto"/>
         <w:spacing w:lineRule="auto" w:line="360" w:before="0" w:after="0"/>
         <w:ind w:hanging="0" w:start="0" w:end="0"/>
@@ -393,7 +380,6 @@
         <w:keepLines w:val="false"/>
         <w:pageBreakBefore w:val="false"/>
         <w:widowControl/>
-        <w:pBdr/>
         <w:shd w:val="clear" w:fill="auto"/>
         <w:spacing w:lineRule="auto" w:line="360" w:before="0" w:after="0"/>
         <w:ind w:hanging="0" w:start="0" w:end="0"/>
@@ -481,7 +467,6 @@
         <w:keepLines w:val="false"/>
         <w:pageBreakBefore w:val="false"/>
         <w:widowControl/>
-        <w:pBdr/>
         <w:shd w:val="clear" w:fill="auto"/>
         <w:spacing w:lineRule="auto" w:line="360" w:before="3600" w:after="0"/>
         <w:ind w:hanging="0" w:start="0" w:end="0"/>
@@ -555,7 +540,6 @@
         <w:keepLines w:val="false"/>
         <w:pageBreakBefore w:val="false"/>
         <w:widowControl/>
-        <w:pBdr/>
         <w:shd w:val="clear" w:fill="auto"/>
         <w:spacing w:lineRule="auto" w:line="240" w:before="1800" w:after="0"/>
         <w:ind w:hanging="0" w:start="4536" w:end="0"/>
@@ -608,7 +592,6 @@
         <w:keepLines w:val="false"/>
         <w:pageBreakBefore w:val="false"/>
         <w:widowControl/>
-        <w:pBdr/>
         <w:shd w:val="clear" w:fill="auto"/>
         <w:spacing w:lineRule="auto" w:line="360" w:before="4200" w:after="0"/>
         <w:ind w:hanging="0" w:start="0" w:end="0"/>
@@ -662,7 +645,6 @@
         <w:keepNext w:val="true"/>
         <w:keepLines w:val="false"/>
         <w:widowControl/>
-        <w:pBdr/>
         <w:shd w:val="clear" w:fill="auto"/>
         <w:spacing w:lineRule="auto" w:line="360" w:before="0" w:after="360"/>
         <w:ind w:hanging="0" w:start="0" w:end="0"/>
@@ -723,7 +705,6 @@
             <w:keepLines w:val="false"/>
             <w:pageBreakBefore w:val="false"/>
             <w:widowControl/>
-            <w:pBdr/>
             <w:tabs>
               <w:tab w:val="clear" w:pos="720"/>
               <w:tab w:val="right" w:pos="9071" w:leader="none"/>
@@ -826,7 +807,6 @@
             <w:keepLines w:val="false"/>
             <w:pageBreakBefore w:val="false"/>
             <w:widowControl/>
-            <w:pBdr/>
             <w:shd w:val="clear" w:fill="auto"/>
             <w:tabs>
               <w:tab w:val="clear" w:pos="720"/>
@@ -885,7 +865,6 @@
             <w:keepLines w:val="false"/>
             <w:pageBreakBefore w:val="false"/>
             <w:widowControl/>
-            <w:pBdr/>
             <w:shd w:val="clear" w:fill="auto"/>
             <w:tabs>
               <w:tab w:val="clear" w:pos="720"/>
@@ -944,7 +923,6 @@
             <w:keepLines w:val="false"/>
             <w:pageBreakBefore w:val="false"/>
             <w:widowControl/>
-            <w:pBdr/>
             <w:shd w:val="clear" w:fill="auto"/>
             <w:tabs>
               <w:tab w:val="clear" w:pos="720"/>
@@ -1003,7 +981,6 @@
             <w:keepLines w:val="false"/>
             <w:pageBreakBefore w:val="false"/>
             <w:widowControl/>
-            <w:pBdr/>
             <w:shd w:val="clear" w:fill="auto"/>
             <w:tabs>
               <w:tab w:val="clear" w:pos="720"/>
@@ -1062,7 +1039,6 @@
             <w:keepLines w:val="false"/>
             <w:pageBreakBefore w:val="false"/>
             <w:widowControl/>
-            <w:pBdr/>
             <w:shd w:val="clear" w:fill="auto"/>
             <w:tabs>
               <w:tab w:val="clear" w:pos="720"/>
@@ -1121,7 +1097,6 @@
             <w:keepLines w:val="false"/>
             <w:pageBreakBefore w:val="false"/>
             <w:widowControl/>
-            <w:pBdr/>
             <w:shd w:val="clear" w:fill="auto"/>
             <w:tabs>
               <w:tab w:val="clear" w:pos="720"/>
@@ -1180,7 +1155,6 @@
             <w:keepLines w:val="false"/>
             <w:pageBreakBefore w:val="false"/>
             <w:widowControl/>
-            <w:pBdr/>
             <w:shd w:val="clear" w:fill="auto"/>
             <w:tabs>
               <w:tab w:val="clear" w:pos="720"/>
@@ -1239,7 +1213,6 @@
             <w:keepLines w:val="false"/>
             <w:pageBreakBefore w:val="false"/>
             <w:widowControl/>
-            <w:pBdr/>
             <w:shd w:val="clear" w:fill="auto"/>
             <w:tabs>
               <w:tab w:val="clear" w:pos="720"/>
@@ -1298,7 +1271,6 @@
             <w:keepLines w:val="false"/>
             <w:pageBreakBefore w:val="false"/>
             <w:widowControl/>
-            <w:pBdr/>
             <w:shd w:val="clear" w:fill="auto"/>
             <w:tabs>
               <w:tab w:val="clear" w:pos="720"/>
@@ -1357,7 +1329,6 @@
             <w:keepLines w:val="false"/>
             <w:pageBreakBefore w:val="false"/>
             <w:widowControl/>
-            <w:pBdr/>
             <w:shd w:val="clear" w:fill="auto"/>
             <w:tabs>
               <w:tab w:val="clear" w:pos="720"/>
@@ -1416,7 +1387,6 @@
             <w:keepLines w:val="false"/>
             <w:pageBreakBefore w:val="false"/>
             <w:widowControl/>
-            <w:pBdr/>
             <w:shd w:val="clear" w:fill="auto"/>
             <w:tabs>
               <w:tab w:val="clear" w:pos="720"/>
@@ -1475,7 +1445,6 @@
             <w:keepLines w:val="false"/>
             <w:pageBreakBefore w:val="false"/>
             <w:widowControl/>
-            <w:pBdr/>
             <w:shd w:val="clear" w:fill="auto"/>
             <w:tabs>
               <w:tab w:val="clear" w:pos="720"/>
@@ -1534,7 +1503,6 @@
             <w:keepLines w:val="false"/>
             <w:pageBreakBefore w:val="false"/>
             <w:widowControl/>
-            <w:pBdr/>
             <w:shd w:val="clear" w:fill="auto"/>
             <w:tabs>
               <w:tab w:val="clear" w:pos="720"/>
@@ -1593,7 +1561,6 @@
             <w:keepLines w:val="false"/>
             <w:pageBreakBefore w:val="false"/>
             <w:widowControl/>
-            <w:pBdr/>
             <w:shd w:val="clear" w:fill="auto"/>
             <w:tabs>
               <w:tab w:val="clear" w:pos="720"/>
@@ -1652,7 +1619,6 @@
             <w:keepLines w:val="false"/>
             <w:pageBreakBefore w:val="false"/>
             <w:widowControl/>
-            <w:pBdr/>
             <w:shd w:val="clear" w:fill="auto"/>
             <w:tabs>
               <w:tab w:val="clear" w:pos="720"/>
@@ -1711,7 +1677,6 @@
             <w:keepLines w:val="false"/>
             <w:pageBreakBefore w:val="false"/>
             <w:widowControl/>
-            <w:pBdr/>
             <w:shd w:val="clear" w:fill="auto"/>
             <w:tabs>
               <w:tab w:val="clear" w:pos="720"/>
@@ -1770,7 +1735,6 @@
             <w:keepLines w:val="false"/>
             <w:pageBreakBefore w:val="false"/>
             <w:widowControl/>
-            <w:pBdr/>
             <w:shd w:val="clear" w:fill="auto"/>
             <w:tabs>
               <w:tab w:val="clear" w:pos="720"/>
@@ -1829,7 +1793,6 @@
             <w:keepLines w:val="false"/>
             <w:pageBreakBefore w:val="false"/>
             <w:widowControl/>
-            <w:pBdr/>
             <w:shd w:val="clear" w:fill="auto"/>
             <w:tabs>
               <w:tab w:val="clear" w:pos="720"/>
@@ -1979,7 +1942,6 @@
           <w:ilvl w:val="0"/>
           <w:numId w:val="1"/>
         </w:numPr>
-        <w:pBdr/>
         <w:shd w:val="clear" w:fill="auto"/>
         <w:spacing w:lineRule="auto" w:line="360" w:before="0" w:after="0"/>
         <w:ind w:hanging="567" w:start="1134" w:end="0"/>
@@ -2040,7 +2002,6 @@
           <w:ilvl w:val="0"/>
           <w:numId w:val="1"/>
         </w:numPr>
-        <w:pBdr/>
         <w:shd w:val="clear" w:fill="auto"/>
         <w:spacing w:lineRule="auto" w:line="360" w:before="0" w:after="0"/>
         <w:ind w:hanging="567" w:start="1134" w:end="0"/>
@@ -2101,7 +2062,6 @@
           <w:ilvl w:val="0"/>
           <w:numId w:val="1"/>
         </w:numPr>
-        <w:pBdr/>
         <w:shd w:val="clear" w:fill="auto"/>
         <w:spacing w:lineRule="auto" w:line="360" w:before="0" w:after="0"/>
         <w:ind w:hanging="567" w:start="1134" w:end="0"/>
@@ -2162,7 +2122,6 @@
           <w:ilvl w:val="0"/>
           <w:numId w:val="1"/>
         </w:numPr>
-        <w:pBdr/>
         <w:shd w:val="clear" w:fill="auto"/>
         <w:spacing w:lineRule="auto" w:line="360" w:before="0" w:after="0"/>
         <w:ind w:hanging="567" w:start="1134" w:end="0"/>
@@ -2229,7 +2188,6 @@
         <w:keepLines/>
         <w:pageBreakBefore w:val="false"/>
         <w:widowControl/>
-        <w:pBdr/>
         <w:shd w:val="clear" w:fill="auto"/>
         <w:spacing w:lineRule="auto" w:line="240" w:before="240" w:after="120"/>
         <w:ind w:hanging="0" w:start="0" w:end="0"/>
@@ -2315,7 +2273,6 @@
               <w:keepNext w:val="true"/>
               <w:keepLines w:val="false"/>
               <w:widowControl/>
-              <w:pBdr/>
               <w:shd w:val="clear" w:fill="auto"/>
               <w:spacing w:lineRule="auto" w:line="240" w:before="40" w:after="40"/>
               <w:ind w:hanging="0" w:start="0" w:end="0"/>
@@ -2379,7 +2336,6 @@
               <w:keepNext w:val="true"/>
               <w:keepLines w:val="false"/>
               <w:widowControl/>
-              <w:pBdr/>
               <w:shd w:val="clear" w:fill="auto"/>
               <w:spacing w:lineRule="auto" w:line="240" w:before="40" w:after="40"/>
               <w:ind w:hanging="0" w:start="0" w:end="0"/>
@@ -2448,7 +2404,6 @@
               <w:keepNext w:val="true"/>
               <w:keepLines w:val="false"/>
               <w:widowControl/>
-              <w:pBdr/>
               <w:shd w:val="clear" w:fill="auto"/>
               <w:spacing w:lineRule="auto" w:line="240" w:before="40" w:after="40"/>
               <w:ind w:hanging="0" w:start="0" w:end="0"/>
@@ -2512,7 +2467,6 @@
               <w:keepNext w:val="true"/>
               <w:keepLines w:val="false"/>
               <w:widowControl/>
-              <w:pBdr/>
               <w:shd w:val="clear" w:fill="auto"/>
               <w:spacing w:lineRule="auto" w:line="240" w:before="40" w:after="40"/>
               <w:ind w:hanging="0" w:start="0" w:end="0"/>
@@ -2581,7 +2535,6 @@
               <w:keepNext w:val="true"/>
               <w:keepLines w:val="false"/>
               <w:widowControl/>
-              <w:pBdr/>
               <w:shd w:val="clear" w:fill="auto"/>
               <w:spacing w:lineRule="auto" w:line="240" w:before="40" w:after="40"/>
               <w:ind w:hanging="0" w:start="0" w:end="0"/>
@@ -2645,7 +2598,6 @@
               <w:keepNext w:val="true"/>
               <w:keepLines w:val="false"/>
               <w:widowControl/>
-              <w:pBdr/>
               <w:shd w:val="clear" w:fill="auto"/>
               <w:spacing w:lineRule="auto" w:line="240" w:before="40" w:after="40"/>
               <w:ind w:hanging="0" w:start="0" w:end="0"/>
@@ -2714,7 +2666,6 @@
               <w:keepNext w:val="true"/>
               <w:keepLines w:val="false"/>
               <w:widowControl/>
-              <w:pBdr/>
               <w:shd w:val="clear" w:fill="auto"/>
               <w:spacing w:lineRule="auto" w:line="240" w:before="40" w:after="40"/>
               <w:ind w:hanging="0" w:start="0" w:end="0"/>
@@ -2778,7 +2729,6 @@
               <w:keepNext w:val="true"/>
               <w:keepLines w:val="false"/>
               <w:widowControl/>
-              <w:pBdr/>
               <w:shd w:val="clear" w:fill="auto"/>
               <w:spacing w:lineRule="auto" w:line="240" w:before="40" w:after="40"/>
               <w:ind w:hanging="0" w:start="0" w:end="0"/>
@@ -2847,7 +2797,6 @@
               <w:keepNext w:val="false"/>
               <w:keepLines w:val="false"/>
               <w:widowControl/>
-              <w:pBdr/>
               <w:shd w:val="clear" w:fill="auto"/>
               <w:spacing w:lineRule="auto" w:line="240" w:before="40" w:after="40"/>
               <w:ind w:hanging="0" w:start="0" w:end="0"/>
@@ -2911,8 +2860,8 @@
               <w:keepNext w:val="false"/>
               <w:keepLines w:val="false"/>
               <w:widowControl/>
-              <w:pBdr/>
               <w:shd w:val="clear" w:fill="auto"/>
+              <w:bidi w:val="0"/>
               <w:spacing w:lineRule="auto" w:line="240" w:before="40" w:after="40"/>
               <w:ind w:hanging="0" w:start="0" w:end="0"/>
               <w:jc w:val="start"/>
@@ -2954,7 +2903,7 @@
                 <w:shd w:fill="auto" w:val="clear"/>
                 <w:vertAlign w:val="baseline"/>
               </w:rPr>
-              <w:t>[INSERIR LINK DO YOUTUBE/VIMEO AQUI]</w:t>
+              <w:t>https://youtu.be/u6v3HpFrPJ0</w:t>
             </w:r>
           </w:p>
         </w:tc>
@@ -2967,7 +2916,6 @@
         <w:keepLines w:val="false"/>
         <w:pageBreakBefore w:val="false"/>
         <w:widowControl/>
-        <w:pBdr/>
         <w:shd w:val="clear" w:fill="auto"/>
         <w:spacing w:lineRule="auto" w:line="240" w:before="60" w:after="240"/>
         <w:ind w:hanging="0" w:start="0" w:end="0"/>
@@ -2992,7 +2940,24 @@
         </w:rPr>
       </w:pPr>
       <w:r>
-        <w:rPr/>
+        <w:rPr>
+          <w:rFonts w:eastAsia="Times New Roman" w:cs="Times New Roman"/>
+          <w:b w:val="false"/>
+          <w:bCs w:val="false"/>
+          <w:i w:val="false"/>
+          <w:iCs w:val="false"/>
+          <w:caps w:val="false"/>
+          <w:smallCaps w:val="false"/>
+          <w:strike w:val="false"/>
+          <w:dstrike w:val="false"/>
+          <w:color w:val="000000"/>
+          <w:position w:val="0"/>
+          <w:sz w:val="20"/>
+          <w:szCs w:val="20"/>
+          <w:u w:val="none"/>
+          <w:shd w:fill="auto" w:val="clear"/>
+          <w:vertAlign w:val="baseline"/>
+        </w:rPr>
       </w:r>
     </w:p>
     <w:p>
@@ -3022,7 +2987,6 @@
         <w:keepLines/>
         <w:pageBreakBefore w:val="false"/>
         <w:widowControl/>
-        <w:pBdr/>
         <w:shd w:val="clear" w:fill="auto"/>
         <w:spacing w:lineRule="auto" w:line="240" w:before="240" w:after="120"/>
         <w:ind w:hanging="0" w:start="0" w:end="0"/>
@@ -3075,7 +3039,6 @@
         <w:keepLines w:val="false"/>
         <w:pageBreakBefore w:val="false"/>
         <w:widowControl/>
-        <w:pBdr/>
         <w:shd w:val="clear" w:fill="auto"/>
         <w:spacing w:lineRule="auto" w:line="240" w:before="0" w:after="60"/>
         <w:ind w:hanging="0" w:start="0" w:end="0"/>
@@ -3148,7 +3111,6 @@
         <w:keepLines w:val="false"/>
         <w:pageBreakBefore w:val="false"/>
         <w:widowControl/>
-        <w:pBdr/>
         <w:shd w:val="clear" w:fill="auto"/>
         <w:spacing w:lineRule="auto" w:line="240" w:before="60" w:after="240"/>
         <w:ind w:hanging="0" w:start="0" w:end="0"/>
@@ -3173,7 +3135,24 @@
         </w:rPr>
       </w:pPr>
       <w:r>
-        <w:rPr/>
+        <w:rPr>
+          <w:rFonts w:eastAsia="Times New Roman" w:cs="Times New Roman"/>
+          <w:b w:val="false"/>
+          <w:bCs w:val="false"/>
+          <w:i w:val="false"/>
+          <w:iCs w:val="false"/>
+          <w:caps w:val="false"/>
+          <w:smallCaps w:val="false"/>
+          <w:strike w:val="false"/>
+          <w:dstrike w:val="false"/>
+          <w:color w:val="000000"/>
+          <w:position w:val="0"/>
+          <w:sz w:val="20"/>
+          <w:szCs w:val="20"/>
+          <w:u w:val="none"/>
+          <w:shd w:fill="auto" w:val="clear"/>
+          <w:vertAlign w:val="baseline"/>
+        </w:rPr>
       </w:r>
     </w:p>
     <w:p>
@@ -3213,7 +3192,6 @@
         <w:keepLines/>
         <w:pageBreakBefore w:val="false"/>
         <w:widowControl/>
-        <w:pBdr/>
         <w:shd w:val="clear" w:fill="auto"/>
         <w:spacing w:lineRule="auto" w:line="240" w:before="240" w:after="120"/>
         <w:ind w:hanging="0" w:start="0" w:end="0"/>
@@ -3266,7 +3244,6 @@
         <w:keepLines w:val="false"/>
         <w:pageBreakBefore w:val="false"/>
         <w:widowControl/>
-        <w:pBdr/>
         <w:shd w:val="clear" w:fill="auto"/>
         <w:spacing w:lineRule="auto" w:line="240" w:before="0" w:after="60"/>
         <w:ind w:hanging="0" w:start="0" w:end="0"/>
@@ -3339,7 +3316,6 @@
         <w:keepLines w:val="false"/>
         <w:pageBreakBefore w:val="false"/>
         <w:widowControl/>
-        <w:pBdr/>
         <w:shd w:val="clear" w:fill="auto"/>
         <w:spacing w:lineRule="auto" w:line="240" w:before="60" w:after="240"/>
         <w:ind w:hanging="0" w:start="0" w:end="0"/>
@@ -3364,7 +3340,24 @@
         </w:rPr>
       </w:pPr>
       <w:r>
-        <w:rPr/>
+        <w:rPr>
+          <w:rFonts w:eastAsia="Times New Roman" w:cs="Times New Roman"/>
+          <w:b w:val="false"/>
+          <w:bCs w:val="false"/>
+          <w:i w:val="false"/>
+          <w:iCs w:val="false"/>
+          <w:caps w:val="false"/>
+          <w:smallCaps w:val="false"/>
+          <w:strike w:val="false"/>
+          <w:dstrike w:val="false"/>
+          <w:color w:val="000000"/>
+          <w:position w:val="0"/>
+          <w:sz w:val="20"/>
+          <w:szCs w:val="20"/>
+          <w:u w:val="none"/>
+          <w:shd w:fill="auto" w:val="clear"/>
+          <w:vertAlign w:val="baseline"/>
+        </w:rPr>
       </w:r>
     </w:p>
     <w:p>
@@ -3384,7 +3377,6 @@
         <w:keepLines/>
         <w:pageBreakBefore w:val="false"/>
         <w:widowControl/>
-        <w:pBdr/>
         <w:shd w:val="clear" w:fill="auto"/>
         <w:spacing w:lineRule="auto" w:line="240" w:before="240" w:after="120"/>
         <w:ind w:hanging="0" w:start="0" w:end="0"/>
@@ -3437,7 +3429,6 @@
         <w:keepLines w:val="false"/>
         <w:pageBreakBefore w:val="false"/>
         <w:widowControl/>
-        <w:pBdr/>
         <w:shd w:val="clear" w:fill="auto"/>
         <w:spacing w:lineRule="auto" w:line="240" w:before="0" w:after="60"/>
         <w:ind w:hanging="0" w:start="0" w:end="0"/>
@@ -3510,7 +3501,6 @@
         <w:keepLines w:val="false"/>
         <w:pageBreakBefore w:val="false"/>
         <w:widowControl/>
-        <w:pBdr/>
         <w:shd w:val="clear" w:fill="auto"/>
         <w:spacing w:lineRule="auto" w:line="240" w:before="60" w:after="240"/>
         <w:ind w:hanging="0" w:start="0" w:end="0"/>
@@ -3535,7 +3525,24 @@
         </w:rPr>
       </w:pPr>
       <w:r>
-        <w:rPr/>
+        <w:rPr>
+          <w:rFonts w:eastAsia="Times New Roman" w:cs="Times New Roman"/>
+          <w:b w:val="false"/>
+          <w:bCs w:val="false"/>
+          <w:i w:val="false"/>
+          <w:iCs w:val="false"/>
+          <w:caps w:val="false"/>
+          <w:smallCaps w:val="false"/>
+          <w:strike w:val="false"/>
+          <w:dstrike w:val="false"/>
+          <w:color w:val="000000"/>
+          <w:position w:val="0"/>
+          <w:sz w:val="20"/>
+          <w:szCs w:val="20"/>
+          <w:u w:val="none"/>
+          <w:shd w:fill="auto" w:val="clear"/>
+          <w:vertAlign w:val="baseline"/>
+        </w:rPr>
       </w:r>
     </w:p>
     <w:p>
@@ -3555,7 +3562,6 @@
         <w:keepLines/>
         <w:pageBreakBefore w:val="false"/>
         <w:widowControl/>
-        <w:pBdr/>
         <w:shd w:val="clear" w:fill="auto"/>
         <w:spacing w:lineRule="auto" w:line="240" w:before="240" w:after="120"/>
         <w:ind w:hanging="0" w:start="0" w:end="0"/>
@@ -3608,7 +3614,6 @@
         <w:keepLines w:val="false"/>
         <w:pageBreakBefore w:val="false"/>
         <w:widowControl/>
-        <w:pBdr/>
         <w:shd w:val="clear" w:fill="auto"/>
         <w:spacing w:lineRule="auto" w:line="240" w:before="0" w:after="60"/>
         <w:ind w:hanging="0" w:start="0" w:end="0"/>
@@ -3681,7 +3686,6 @@
         <w:keepLines w:val="false"/>
         <w:pageBreakBefore w:val="false"/>
         <w:widowControl/>
-        <w:pBdr/>
         <w:shd w:val="clear" w:fill="auto"/>
         <w:spacing w:lineRule="auto" w:line="240" w:before="60" w:after="240"/>
         <w:ind w:hanging="0" w:start="0" w:end="0"/>
@@ -3706,7 +3710,24 @@
         </w:rPr>
       </w:pPr>
       <w:r>
-        <w:rPr/>
+        <w:rPr>
+          <w:rFonts w:eastAsia="Times New Roman" w:cs="Times New Roman"/>
+          <w:b w:val="false"/>
+          <w:bCs w:val="false"/>
+          <w:i w:val="false"/>
+          <w:iCs w:val="false"/>
+          <w:caps w:val="false"/>
+          <w:smallCaps w:val="false"/>
+          <w:strike w:val="false"/>
+          <w:dstrike w:val="false"/>
+          <w:color w:val="000000"/>
+          <w:position w:val="0"/>
+          <w:sz w:val="20"/>
+          <w:szCs w:val="20"/>
+          <w:u w:val="none"/>
+          <w:shd w:fill="auto" w:val="clear"/>
+          <w:vertAlign w:val="baseline"/>
+        </w:rPr>
       </w:r>
     </w:p>
     <w:p>
@@ -3726,7 +3747,6 @@
         <w:keepLines/>
         <w:pageBreakBefore w:val="false"/>
         <w:widowControl/>
-        <w:pBdr/>
         <w:shd w:val="clear" w:fill="auto"/>
         <w:spacing w:lineRule="auto" w:line="240" w:before="240" w:after="120"/>
         <w:ind w:hanging="0" w:start="0" w:end="0"/>
@@ -3779,7 +3799,6 @@
         <w:keepLines w:val="false"/>
         <w:pageBreakBefore w:val="false"/>
         <w:widowControl/>
-        <w:pBdr/>
         <w:shd w:val="clear" w:fill="auto"/>
         <w:spacing w:lineRule="auto" w:line="240" w:before="0" w:after="60"/>
         <w:ind w:hanging="0" w:start="0" w:end="0"/>
@@ -3852,7 +3871,6 @@
         <w:keepLines w:val="false"/>
         <w:pageBreakBefore w:val="false"/>
         <w:widowControl/>
-        <w:pBdr/>
         <w:shd w:val="clear" w:fill="auto"/>
         <w:spacing w:lineRule="auto" w:line="240" w:before="60" w:after="240"/>
         <w:ind w:hanging="0" w:start="0" w:end="0"/>
@@ -3877,7 +3895,24 @@
         </w:rPr>
       </w:pPr>
       <w:r>
-        <w:rPr/>
+        <w:rPr>
+          <w:rFonts w:eastAsia="Times New Roman" w:cs="Times New Roman"/>
+          <w:b w:val="false"/>
+          <w:bCs w:val="false"/>
+          <w:i w:val="false"/>
+          <w:iCs w:val="false"/>
+          <w:caps w:val="false"/>
+          <w:smallCaps w:val="false"/>
+          <w:strike w:val="false"/>
+          <w:dstrike w:val="false"/>
+          <w:color w:val="000000"/>
+          <w:position w:val="0"/>
+          <w:sz w:val="20"/>
+          <w:szCs w:val="20"/>
+          <w:u w:val="none"/>
+          <w:shd w:fill="auto" w:val="clear"/>
+          <w:vertAlign w:val="baseline"/>
+        </w:rPr>
       </w:r>
     </w:p>
     <w:p>
@@ -3978,7 +4013,6 @@
         <w:keepLines/>
         <w:pageBreakBefore w:val="false"/>
         <w:widowControl/>
-        <w:pBdr/>
         <w:shd w:val="clear" w:fill="auto"/>
         <w:spacing w:lineRule="auto" w:line="240" w:before="240" w:after="120"/>
         <w:ind w:hanging="0" w:start="0" w:end="0"/>
@@ -4040,9 +4074,9 @@
         <w:tblLook w:val="0000"/>
       </w:tblPr>
       <w:tblGrid>
-        <w:gridCol w:w="2355"/>
+        <w:gridCol w:w="2354"/>
         <w:gridCol w:w="2238"/>
-        <w:gridCol w:w="2004"/>
+        <w:gridCol w:w="2005"/>
         <w:gridCol w:w="2474"/>
       </w:tblGrid>
       <w:tr>
@@ -4052,7 +4086,7 @@
         </w:trPr>
         <w:tc>
           <w:tcPr>
-            <w:tcW w:w="2355" w:type="dxa"/>
+            <w:tcW w:w="2354" w:type="dxa"/>
             <w:tcBorders>
               <w:top w:val="single" w:sz="8" w:space="0" w:color="000000"/>
               <w:bottom w:val="single" w:sz="4" w:space="0" w:color="000000"/>
@@ -4065,7 +4099,6 @@
               <w:keepNext w:val="true"/>
               <w:keepLines w:val="false"/>
               <w:widowControl/>
-              <w:pBdr/>
               <w:shd w:val="clear" w:fill="auto"/>
               <w:spacing w:lineRule="auto" w:line="240" w:before="40" w:after="40"/>
               <w:ind w:hanging="0" w:start="0" w:end="0"/>
@@ -4127,7 +4160,6 @@
               <w:keepNext w:val="true"/>
               <w:keepLines w:val="false"/>
               <w:widowControl/>
-              <w:pBdr/>
               <w:shd w:val="clear" w:fill="auto"/>
               <w:spacing w:lineRule="auto" w:line="240" w:before="40" w:after="40"/>
               <w:ind w:hanging="0" w:start="0" w:end="0"/>
@@ -4176,7 +4208,7 @@
         </w:tc>
         <w:tc>
           <w:tcPr>
-            <w:tcW w:w="2004" w:type="dxa"/>
+            <w:tcW w:w="2005" w:type="dxa"/>
             <w:tcBorders>
               <w:top w:val="single" w:sz="8" w:space="0" w:color="000000"/>
               <w:bottom w:val="single" w:sz="4" w:space="0" w:color="000000"/>
@@ -4189,7 +4221,6 @@
               <w:keepNext w:val="true"/>
               <w:keepLines w:val="false"/>
               <w:widowControl/>
-              <w:pBdr/>
               <w:shd w:val="clear" w:fill="auto"/>
               <w:spacing w:lineRule="auto" w:line="240" w:before="40" w:after="40"/>
               <w:ind w:hanging="0" w:start="0" w:end="0"/>
@@ -4251,7 +4282,6 @@
               <w:keepNext w:val="true"/>
               <w:keepLines w:val="false"/>
               <w:widowControl/>
-              <w:pBdr/>
               <w:shd w:val="clear" w:fill="auto"/>
               <w:spacing w:lineRule="auto" w:line="240" w:before="40" w:after="40"/>
               <w:ind w:hanging="0" w:start="0" w:end="0"/>
@@ -4305,7 +4335,7 @@
         </w:trPr>
         <w:tc>
           <w:tcPr>
-            <w:tcW w:w="2355" w:type="dxa"/>
+            <w:tcW w:w="2354" w:type="dxa"/>
             <w:tcBorders/>
             <w:vAlign w:val="center"/>
           </w:tcPr>
@@ -4315,7 +4345,6 @@
               <w:keepNext w:val="true"/>
               <w:keepLines w:val="false"/>
               <w:widowControl/>
-              <w:pBdr/>
               <w:shd w:val="clear" w:fill="auto"/>
               <w:spacing w:lineRule="auto" w:line="240" w:before="40" w:after="40"/>
               <w:ind w:hanging="0" w:start="0" w:end="0"/>
@@ -4374,7 +4403,6 @@
               <w:keepNext w:val="true"/>
               <w:keepLines w:val="false"/>
               <w:widowControl/>
-              <w:pBdr/>
               <w:shd w:val="clear" w:fill="auto"/>
               <w:spacing w:lineRule="auto" w:line="240" w:before="40" w:after="40"/>
               <w:ind w:hanging="0" w:start="0" w:end="0"/>
@@ -4423,7 +4451,7 @@
         </w:tc>
         <w:tc>
           <w:tcPr>
-            <w:tcW w:w="2004" w:type="dxa"/>
+            <w:tcW w:w="2005" w:type="dxa"/>
             <w:tcBorders/>
             <w:vAlign w:val="center"/>
           </w:tcPr>
@@ -4433,7 +4461,6 @@
               <w:keepNext w:val="true"/>
               <w:keepLines w:val="false"/>
               <w:widowControl/>
-              <w:pBdr/>
               <w:shd w:val="clear" w:fill="auto"/>
               <w:spacing w:lineRule="auto" w:line="240" w:before="40" w:after="40"/>
               <w:ind w:hanging="0" w:start="0" w:end="0"/>
@@ -4492,7 +4519,6 @@
               <w:keepNext w:val="true"/>
               <w:keepLines w:val="false"/>
               <w:widowControl/>
-              <w:pBdr/>
               <w:shd w:val="clear" w:fill="auto"/>
               <w:spacing w:lineRule="auto" w:line="240" w:before="40" w:after="40"/>
               <w:ind w:hanging="0" w:start="0" w:end="0"/>
@@ -4546,7 +4572,7 @@
         </w:trPr>
         <w:tc>
           <w:tcPr>
-            <w:tcW w:w="2355" w:type="dxa"/>
+            <w:tcW w:w="2354" w:type="dxa"/>
             <w:tcBorders/>
             <w:vAlign w:val="center"/>
           </w:tcPr>
@@ -4556,7 +4582,6 @@
               <w:keepNext w:val="true"/>
               <w:keepLines w:val="false"/>
               <w:widowControl/>
-              <w:pBdr/>
               <w:shd w:val="clear" w:fill="auto"/>
               <w:spacing w:lineRule="auto" w:line="240" w:before="40" w:after="40"/>
               <w:ind w:hanging="0" w:start="0" w:end="0"/>
@@ -4615,7 +4640,6 @@
               <w:keepNext w:val="true"/>
               <w:keepLines w:val="false"/>
               <w:widowControl/>
-              <w:pBdr/>
               <w:shd w:val="clear" w:fill="auto"/>
               <w:spacing w:lineRule="auto" w:line="240" w:before="40" w:after="40"/>
               <w:ind w:hanging="0" w:start="0" w:end="0"/>
@@ -4664,7 +4688,7 @@
         </w:tc>
         <w:tc>
           <w:tcPr>
-            <w:tcW w:w="2004" w:type="dxa"/>
+            <w:tcW w:w="2005" w:type="dxa"/>
             <w:tcBorders/>
             <w:vAlign w:val="center"/>
           </w:tcPr>
@@ -4674,7 +4698,6 @@
               <w:keepNext w:val="true"/>
               <w:keepLines w:val="false"/>
               <w:widowControl/>
-              <w:pBdr/>
               <w:shd w:val="clear" w:fill="auto"/>
               <w:spacing w:lineRule="auto" w:line="240" w:before="40" w:after="40"/>
               <w:ind w:hanging="0" w:start="0" w:end="0"/>
@@ -4733,7 +4756,6 @@
               <w:keepNext w:val="true"/>
               <w:keepLines w:val="false"/>
               <w:widowControl/>
-              <w:pBdr/>
               <w:shd w:val="clear" w:fill="auto"/>
               <w:spacing w:lineRule="auto" w:line="240" w:before="40" w:after="40"/>
               <w:ind w:hanging="0" w:start="0" w:end="0"/>
@@ -4788,7 +4810,7 @@
         </w:trPr>
         <w:tc>
           <w:tcPr>
-            <w:tcW w:w="2355" w:type="dxa"/>
+            <w:tcW w:w="2354" w:type="dxa"/>
             <w:tcBorders>
               <w:bottom w:val="single" w:sz="8" w:space="0" w:color="000000"/>
             </w:tcBorders>
@@ -4800,7 +4822,6 @@
               <w:keepNext w:val="false"/>
               <w:keepLines w:val="false"/>
               <w:widowControl/>
-              <w:pBdr/>
               <w:shd w:val="clear" w:fill="auto"/>
               <w:spacing w:lineRule="auto" w:line="240" w:before="40" w:after="40"/>
               <w:ind w:hanging="0" w:start="0" w:end="0"/>
@@ -4861,7 +4882,6 @@
               <w:keepNext w:val="false"/>
               <w:keepLines w:val="false"/>
               <w:widowControl/>
-              <w:pBdr/>
               <w:shd w:val="clear" w:fill="auto"/>
               <w:spacing w:lineRule="auto" w:line="240" w:before="40" w:after="40"/>
               <w:ind w:hanging="0" w:start="0" w:end="0"/>
@@ -4910,7 +4930,7 @@
         </w:tc>
         <w:tc>
           <w:tcPr>
-            <w:tcW w:w="2004" w:type="dxa"/>
+            <w:tcW w:w="2005" w:type="dxa"/>
             <w:tcBorders>
               <w:bottom w:val="single" w:sz="8" w:space="0" w:color="000000"/>
             </w:tcBorders>
@@ -4922,7 +4942,6 @@
               <w:keepNext w:val="false"/>
               <w:keepLines w:val="false"/>
               <w:widowControl/>
-              <w:pBdr/>
               <w:shd w:val="clear" w:fill="auto"/>
               <w:spacing w:lineRule="auto" w:line="240" w:before="40" w:after="40"/>
               <w:ind w:hanging="0" w:start="0" w:end="0"/>
@@ -4983,7 +5002,6 @@
               <w:keepNext w:val="false"/>
               <w:keepLines w:val="false"/>
               <w:widowControl/>
-              <w:pBdr/>
               <w:shd w:val="clear" w:fill="auto"/>
               <w:spacing w:lineRule="auto" w:line="240" w:before="40" w:after="40"/>
               <w:ind w:hanging="0" w:start="0" w:end="0"/>
@@ -5039,7 +5057,6 @@
         <w:keepLines w:val="false"/>
         <w:pageBreakBefore w:val="false"/>
         <w:widowControl/>
-        <w:pBdr/>
         <w:shd w:val="clear" w:fill="auto"/>
         <w:spacing w:lineRule="auto" w:line="240" w:before="60" w:after="240"/>
         <w:ind w:hanging="0" w:start="0" w:end="0"/>
@@ -5285,7 +5302,6 @@
         <w:keepLines/>
         <w:pageBreakBefore w:val="false"/>
         <w:widowControl/>
-        <w:pBdr/>
         <w:shd w:val="clear" w:fill="auto"/>
         <w:spacing w:lineRule="auto" w:line="240" w:before="240" w:after="120"/>
         <w:ind w:hanging="0" w:start="0" w:end="0"/>
@@ -5347,12 +5363,12 @@
         <w:tblLook w:val="0000"/>
       </w:tblPr>
       <w:tblGrid>
-        <w:gridCol w:w="2640"/>
-        <w:gridCol w:w="1264"/>
+        <w:gridCol w:w="2639"/>
+        <w:gridCol w:w="1265"/>
         <w:gridCol w:w="1493"/>
         <w:gridCol w:w="1378"/>
-        <w:gridCol w:w="1205"/>
-        <w:gridCol w:w="1091"/>
+        <w:gridCol w:w="1204"/>
+        <w:gridCol w:w="1092"/>
       </w:tblGrid>
       <w:tr>
         <w:trPr>
@@ -5361,7 +5377,7 @@
         </w:trPr>
         <w:tc>
           <w:tcPr>
-            <w:tcW w:w="2640" w:type="dxa"/>
+            <w:tcW w:w="2639" w:type="dxa"/>
             <w:tcBorders>
               <w:top w:val="single" w:sz="8" w:space="0" w:color="000000"/>
               <w:bottom w:val="single" w:sz="4" w:space="0" w:color="000000"/>
@@ -5374,7 +5390,6 @@
               <w:keepNext w:val="true"/>
               <w:keepLines w:val="false"/>
               <w:widowControl/>
-              <w:pBdr/>
               <w:shd w:val="clear" w:fill="auto"/>
               <w:spacing w:lineRule="auto" w:line="240" w:before="40" w:after="40"/>
               <w:ind w:hanging="0" w:start="0" w:end="0"/>
@@ -5423,7 +5438,7 @@
         </w:tc>
         <w:tc>
           <w:tcPr>
-            <w:tcW w:w="1264" w:type="dxa"/>
+            <w:tcW w:w="1265" w:type="dxa"/>
             <w:tcBorders>
               <w:top w:val="single" w:sz="8" w:space="0" w:color="000000"/>
               <w:bottom w:val="single" w:sz="4" w:space="0" w:color="000000"/>
@@ -5436,7 +5451,6 @@
               <w:keepNext w:val="true"/>
               <w:keepLines w:val="false"/>
               <w:widowControl/>
-              <w:pBdr/>
               <w:shd w:val="clear" w:fill="auto"/>
               <w:spacing w:lineRule="auto" w:line="240" w:before="40" w:after="40"/>
               <w:ind w:hanging="0" w:start="0" w:end="0"/>
@@ -5498,7 +5512,6 @@
               <w:keepNext w:val="true"/>
               <w:keepLines w:val="false"/>
               <w:widowControl/>
-              <w:pBdr/>
               <w:shd w:val="clear" w:fill="auto"/>
               <w:spacing w:lineRule="auto" w:line="240" w:before="40" w:after="40"/>
               <w:ind w:hanging="0" w:start="0" w:end="0"/>
@@ -5560,7 +5573,6 @@
               <w:keepNext w:val="true"/>
               <w:keepLines w:val="false"/>
               <w:widowControl/>
-              <w:pBdr/>
               <w:shd w:val="clear" w:fill="auto"/>
               <w:spacing w:lineRule="auto" w:line="240" w:before="40" w:after="40"/>
               <w:ind w:hanging="0" w:start="0" w:end="0"/>
@@ -5609,7 +5621,7 @@
         </w:tc>
         <w:tc>
           <w:tcPr>
-            <w:tcW w:w="1205" w:type="dxa"/>
+            <w:tcW w:w="1204" w:type="dxa"/>
             <w:tcBorders>
               <w:top w:val="single" w:sz="8" w:space="0" w:color="000000"/>
               <w:bottom w:val="single" w:sz="4" w:space="0" w:color="000000"/>
@@ -5622,7 +5634,6 @@
               <w:keepNext w:val="true"/>
               <w:keepLines w:val="false"/>
               <w:widowControl/>
-              <w:pBdr/>
               <w:shd w:val="clear" w:fill="auto"/>
               <w:spacing w:lineRule="auto" w:line="240" w:before="40" w:after="40"/>
               <w:ind w:hanging="0" w:start="0" w:end="0"/>
@@ -5671,7 +5682,7 @@
         </w:tc>
         <w:tc>
           <w:tcPr>
-            <w:tcW w:w="1091" w:type="dxa"/>
+            <w:tcW w:w="1092" w:type="dxa"/>
             <w:tcBorders>
               <w:top w:val="single" w:sz="8" w:space="0" w:color="000000"/>
               <w:bottom w:val="single" w:sz="4" w:space="0" w:color="000000"/>
@@ -5684,7 +5695,6 @@
               <w:keepNext w:val="true"/>
               <w:keepLines w:val="false"/>
               <w:widowControl/>
-              <w:pBdr/>
               <w:shd w:val="clear" w:fill="auto"/>
               <w:spacing w:lineRule="auto" w:line="240" w:before="40" w:after="40"/>
               <w:ind w:hanging="0" w:start="0" w:end="0"/>
@@ -5738,7 +5748,7 @@
         </w:trPr>
         <w:tc>
           <w:tcPr>
-            <w:tcW w:w="2640" w:type="dxa"/>
+            <w:tcW w:w="2639" w:type="dxa"/>
             <w:tcBorders/>
             <w:vAlign w:val="center"/>
           </w:tcPr>
@@ -5748,7 +5758,6 @@
               <w:keepNext w:val="true"/>
               <w:keepLines w:val="false"/>
               <w:widowControl/>
-              <w:pBdr/>
               <w:shd w:val="clear" w:fill="auto"/>
               <w:spacing w:lineRule="auto" w:line="240" w:before="40" w:after="40"/>
               <w:ind w:hanging="0" w:start="0" w:end="0"/>
@@ -5797,7 +5806,7 @@
         </w:tc>
         <w:tc>
           <w:tcPr>
-            <w:tcW w:w="1264" w:type="dxa"/>
+            <w:tcW w:w="1265" w:type="dxa"/>
             <w:tcBorders/>
             <w:vAlign w:val="center"/>
           </w:tcPr>
@@ -5807,7 +5816,6 @@
               <w:keepNext w:val="true"/>
               <w:keepLines w:val="false"/>
               <w:widowControl/>
-              <w:pBdr/>
               <w:shd w:val="clear" w:fill="auto"/>
               <w:spacing w:lineRule="auto" w:line="240" w:before="40" w:after="40"/>
               <w:ind w:hanging="0" w:start="0" w:end="0"/>
@@ -5866,7 +5874,6 @@
               <w:keepNext w:val="true"/>
               <w:keepLines w:val="false"/>
               <w:widowControl/>
-              <w:pBdr/>
               <w:shd w:val="clear" w:fill="auto"/>
               <w:spacing w:lineRule="auto" w:line="240" w:before="40" w:after="40"/>
               <w:ind w:hanging="0" w:start="0" w:end="0"/>
@@ -5925,7 +5932,6 @@
               <w:keepNext w:val="true"/>
               <w:keepLines w:val="false"/>
               <w:widowControl/>
-              <w:pBdr/>
               <w:shd w:val="clear" w:fill="auto"/>
               <w:spacing w:lineRule="auto" w:line="240" w:before="40" w:after="40"/>
               <w:ind w:hanging="0" w:start="0" w:end="0"/>
@@ -5974,7 +5980,7 @@
         </w:tc>
         <w:tc>
           <w:tcPr>
-            <w:tcW w:w="1205" w:type="dxa"/>
+            <w:tcW w:w="1204" w:type="dxa"/>
             <w:tcBorders/>
             <w:vAlign w:val="center"/>
           </w:tcPr>
@@ -5984,7 +5990,6 @@
               <w:keepNext w:val="true"/>
               <w:keepLines w:val="false"/>
               <w:widowControl/>
-              <w:pBdr/>
               <w:shd w:val="clear" w:fill="auto"/>
               <w:spacing w:lineRule="auto" w:line="240" w:before="40" w:after="40"/>
               <w:ind w:hanging="0" w:start="0" w:end="0"/>
@@ -6033,7 +6038,7 @@
         </w:tc>
         <w:tc>
           <w:tcPr>
-            <w:tcW w:w="1091" w:type="dxa"/>
+            <w:tcW w:w="1092" w:type="dxa"/>
             <w:tcBorders/>
             <w:vAlign w:val="center"/>
           </w:tcPr>
@@ -6043,7 +6048,6 @@
               <w:keepNext w:val="true"/>
               <w:keepLines w:val="false"/>
               <w:widowControl/>
-              <w:pBdr/>
               <w:shd w:val="clear" w:fill="auto"/>
               <w:spacing w:lineRule="auto" w:line="240" w:before="40" w:after="40"/>
               <w:ind w:hanging="0" w:start="0" w:end="0"/>
@@ -6097,7 +6101,7 @@
         </w:trPr>
         <w:tc>
           <w:tcPr>
-            <w:tcW w:w="2640" w:type="dxa"/>
+            <w:tcW w:w="2639" w:type="dxa"/>
             <w:tcBorders/>
             <w:vAlign w:val="center"/>
           </w:tcPr>
@@ -6107,7 +6111,6 @@
               <w:keepNext w:val="true"/>
               <w:keepLines w:val="false"/>
               <w:widowControl/>
-              <w:pBdr/>
               <w:shd w:val="clear" w:fill="auto"/>
               <w:spacing w:lineRule="auto" w:line="240" w:before="40" w:after="40"/>
               <w:ind w:hanging="0" w:start="0" w:end="0"/>
@@ -6156,7 +6159,7 @@
         </w:tc>
         <w:tc>
           <w:tcPr>
-            <w:tcW w:w="1264" w:type="dxa"/>
+            <w:tcW w:w="1265" w:type="dxa"/>
             <w:tcBorders/>
             <w:vAlign w:val="center"/>
           </w:tcPr>
@@ -6166,7 +6169,6 @@
               <w:keepNext w:val="true"/>
               <w:keepLines w:val="false"/>
               <w:widowControl/>
-              <w:pBdr/>
               <w:shd w:val="clear" w:fill="auto"/>
               <w:spacing w:lineRule="auto" w:line="240" w:before="40" w:after="40"/>
               <w:ind w:hanging="0" w:start="0" w:end="0"/>
@@ -6225,7 +6227,6 @@
               <w:keepNext w:val="true"/>
               <w:keepLines w:val="false"/>
               <w:widowControl/>
-              <w:pBdr/>
               <w:shd w:val="clear" w:fill="auto"/>
               <w:spacing w:lineRule="auto" w:line="240" w:before="40" w:after="40"/>
               <w:ind w:hanging="0" w:start="0" w:end="0"/>
@@ -6284,7 +6285,6 @@
               <w:keepNext w:val="true"/>
               <w:keepLines w:val="false"/>
               <w:widowControl/>
-              <w:pBdr/>
               <w:shd w:val="clear" w:fill="auto"/>
               <w:spacing w:lineRule="auto" w:line="240" w:before="40" w:after="40"/>
               <w:ind w:hanging="0" w:start="0" w:end="0"/>
@@ -6333,7 +6333,7 @@
         </w:tc>
         <w:tc>
           <w:tcPr>
-            <w:tcW w:w="1205" w:type="dxa"/>
+            <w:tcW w:w="1204" w:type="dxa"/>
             <w:tcBorders/>
             <w:vAlign w:val="center"/>
           </w:tcPr>
@@ -6343,7 +6343,6 @@
               <w:keepNext w:val="true"/>
               <w:keepLines w:val="false"/>
               <w:widowControl/>
-              <w:pBdr/>
               <w:shd w:val="clear" w:fill="auto"/>
               <w:spacing w:lineRule="auto" w:line="240" w:before="40" w:after="40"/>
               <w:ind w:hanging="0" w:start="0" w:end="0"/>
@@ -6392,7 +6391,7 @@
         </w:tc>
         <w:tc>
           <w:tcPr>
-            <w:tcW w:w="1091" w:type="dxa"/>
+            <w:tcW w:w="1092" w:type="dxa"/>
             <w:tcBorders/>
             <w:vAlign w:val="center"/>
           </w:tcPr>
@@ -6402,7 +6401,6 @@
               <w:keepNext w:val="true"/>
               <w:keepLines w:val="false"/>
               <w:widowControl/>
-              <w:pBdr/>
               <w:shd w:val="clear" w:fill="auto"/>
               <w:spacing w:lineRule="auto" w:line="240" w:before="40" w:after="40"/>
               <w:ind w:hanging="0" w:start="0" w:end="0"/>
@@ -6456,7 +6454,7 @@
         </w:trPr>
         <w:tc>
           <w:tcPr>
-            <w:tcW w:w="2640" w:type="dxa"/>
+            <w:tcW w:w="2639" w:type="dxa"/>
             <w:tcBorders>
               <w:bottom w:val="single" w:sz="8" w:space="0" w:color="000000"/>
             </w:tcBorders>
@@ -6468,7 +6466,6 @@
               <w:keepNext w:val="false"/>
               <w:keepLines w:val="false"/>
               <w:widowControl/>
-              <w:pBdr/>
               <w:shd w:val="clear" w:fill="auto"/>
               <w:spacing w:lineRule="auto" w:line="240" w:before="40" w:after="40"/>
               <w:ind w:hanging="0" w:start="0" w:end="0"/>
@@ -6517,7 +6514,7 @@
         </w:tc>
         <w:tc>
           <w:tcPr>
-            <w:tcW w:w="1264" w:type="dxa"/>
+            <w:tcW w:w="1265" w:type="dxa"/>
             <w:tcBorders>
               <w:bottom w:val="single" w:sz="8" w:space="0" w:color="000000"/>
             </w:tcBorders>
@@ -6529,7 +6526,6 @@
               <w:keepNext w:val="false"/>
               <w:keepLines w:val="false"/>
               <w:widowControl/>
-              <w:pBdr/>
               <w:shd w:val="clear" w:fill="auto"/>
               <w:spacing w:lineRule="auto" w:line="240" w:before="40" w:after="40"/>
               <w:ind w:hanging="0" w:start="0" w:end="0"/>
@@ -6590,7 +6586,6 @@
               <w:keepNext w:val="false"/>
               <w:keepLines w:val="false"/>
               <w:widowControl/>
-              <w:pBdr/>
               <w:shd w:val="clear" w:fill="auto"/>
               <w:spacing w:lineRule="auto" w:line="240" w:before="40" w:after="40"/>
               <w:ind w:hanging="0" w:start="0" w:end="0"/>
@@ -6651,7 +6646,6 @@
               <w:keepNext w:val="false"/>
               <w:keepLines w:val="false"/>
               <w:widowControl/>
-              <w:pBdr/>
               <w:shd w:val="clear" w:fill="auto"/>
               <w:spacing w:lineRule="auto" w:line="240" w:before="40" w:after="40"/>
               <w:ind w:hanging="0" w:start="0" w:end="0"/>
@@ -6700,7 +6694,7 @@
         </w:tc>
         <w:tc>
           <w:tcPr>
-            <w:tcW w:w="1205" w:type="dxa"/>
+            <w:tcW w:w="1204" w:type="dxa"/>
             <w:tcBorders>
               <w:bottom w:val="single" w:sz="8" w:space="0" w:color="000000"/>
             </w:tcBorders>
@@ -6712,7 +6706,6 @@
               <w:keepNext w:val="false"/>
               <w:keepLines w:val="false"/>
               <w:widowControl/>
-              <w:pBdr/>
               <w:shd w:val="clear" w:fill="auto"/>
               <w:spacing w:lineRule="auto" w:line="240" w:before="40" w:after="40"/>
               <w:ind w:hanging="0" w:start="0" w:end="0"/>
@@ -6761,7 +6754,7 @@
         </w:tc>
         <w:tc>
           <w:tcPr>
-            <w:tcW w:w="1091" w:type="dxa"/>
+            <w:tcW w:w="1092" w:type="dxa"/>
             <w:tcBorders>
               <w:bottom w:val="single" w:sz="8" w:space="0" w:color="000000"/>
             </w:tcBorders>
@@ -6773,7 +6766,6 @@
               <w:keepNext w:val="false"/>
               <w:keepLines w:val="false"/>
               <w:widowControl/>
-              <w:pBdr/>
               <w:shd w:val="clear" w:fill="auto"/>
               <w:spacing w:lineRule="auto" w:line="240" w:before="40" w:after="40"/>
               <w:ind w:hanging="0" w:start="0" w:end="0"/>
@@ -6829,7 +6821,6 @@
         <w:keepLines w:val="false"/>
         <w:pageBreakBefore w:val="false"/>
         <w:widowControl/>
-        <w:pBdr/>
         <w:shd w:val="clear" w:fill="auto"/>
         <w:spacing w:lineRule="auto" w:line="240" w:before="60" w:after="240"/>
         <w:ind w:hanging="0" w:start="0" w:end="0"/>
@@ -6854,7 +6845,24 @@
         </w:rPr>
       </w:pPr>
       <w:r>
-        <w:rPr/>
+        <w:rPr>
+          <w:rFonts w:eastAsia="Times New Roman" w:cs="Times New Roman"/>
+          <w:b w:val="false"/>
+          <w:bCs w:val="false"/>
+          <w:i w:val="false"/>
+          <w:iCs w:val="false"/>
+          <w:caps w:val="false"/>
+          <w:smallCaps w:val="false"/>
+          <w:strike w:val="false"/>
+          <w:dstrike w:val="false"/>
+          <w:color w:val="000000"/>
+          <w:position w:val="0"/>
+          <w:sz w:val="20"/>
+          <w:szCs w:val="20"/>
+          <w:u w:val="none"/>
+          <w:shd w:fill="auto" w:val="clear"/>
+          <w:vertAlign w:val="baseline"/>
+        </w:rPr>
       </w:r>
     </w:p>
     <w:p>
@@ -6884,7 +6892,6 @@
         <w:keepLines/>
         <w:pageBreakBefore w:val="false"/>
         <w:widowControl/>
-        <w:pBdr/>
         <w:shd w:val="clear" w:fill="auto"/>
         <w:spacing w:lineRule="auto" w:line="240" w:before="240" w:after="120"/>
         <w:ind w:hanging="0" w:start="0" w:end="0"/>
@@ -6946,12 +6953,12 @@
         <w:tblLook w:val="0000"/>
       </w:tblPr>
       <w:tblGrid>
-        <w:gridCol w:w="2640"/>
-        <w:gridCol w:w="1264"/>
+        <w:gridCol w:w="2639"/>
+        <w:gridCol w:w="1265"/>
         <w:gridCol w:w="1493"/>
         <w:gridCol w:w="1378"/>
-        <w:gridCol w:w="1205"/>
-        <w:gridCol w:w="1091"/>
+        <w:gridCol w:w="1204"/>
+        <w:gridCol w:w="1092"/>
       </w:tblGrid>
       <w:tr>
         <w:trPr>
@@ -6960,7 +6967,7 @@
         </w:trPr>
         <w:tc>
           <w:tcPr>
-            <w:tcW w:w="2640" w:type="dxa"/>
+            <w:tcW w:w="2639" w:type="dxa"/>
             <w:tcBorders>
               <w:top w:val="single" w:sz="8" w:space="0" w:color="000000"/>
               <w:bottom w:val="single" w:sz="4" w:space="0" w:color="000000"/>
@@ -6973,7 +6980,6 @@
               <w:keepNext w:val="true"/>
               <w:keepLines w:val="false"/>
               <w:widowControl/>
-              <w:pBdr/>
               <w:shd w:val="clear" w:fill="auto"/>
               <w:spacing w:lineRule="auto" w:line="240" w:before="40" w:after="40"/>
               <w:ind w:hanging="0" w:start="0" w:end="0"/>
@@ -7022,7 +7028,7 @@
         </w:tc>
         <w:tc>
           <w:tcPr>
-            <w:tcW w:w="1264" w:type="dxa"/>
+            <w:tcW w:w="1265" w:type="dxa"/>
             <w:tcBorders>
               <w:top w:val="single" w:sz="8" w:space="0" w:color="000000"/>
               <w:bottom w:val="single" w:sz="4" w:space="0" w:color="000000"/>
@@ -7035,7 +7041,6 @@
               <w:keepNext w:val="true"/>
               <w:keepLines w:val="false"/>
               <w:widowControl/>
-              <w:pBdr/>
               <w:shd w:val="clear" w:fill="auto"/>
               <w:spacing w:lineRule="auto" w:line="240" w:before="40" w:after="40"/>
               <w:ind w:hanging="0" w:start="0" w:end="0"/>
@@ -7097,7 +7102,6 @@
               <w:keepNext w:val="true"/>
               <w:keepLines w:val="false"/>
               <w:widowControl/>
-              <w:pBdr/>
               <w:shd w:val="clear" w:fill="auto"/>
               <w:spacing w:lineRule="auto" w:line="240" w:before="40" w:after="40"/>
               <w:ind w:hanging="0" w:start="0" w:end="0"/>
@@ -7159,7 +7163,6 @@
               <w:keepNext w:val="true"/>
               <w:keepLines w:val="false"/>
               <w:widowControl/>
-              <w:pBdr/>
               <w:shd w:val="clear" w:fill="auto"/>
               <w:spacing w:lineRule="auto" w:line="240" w:before="40" w:after="40"/>
               <w:ind w:hanging="0" w:start="0" w:end="0"/>
@@ -7208,7 +7211,7 @@
         </w:tc>
         <w:tc>
           <w:tcPr>
-            <w:tcW w:w="1205" w:type="dxa"/>
+            <w:tcW w:w="1204" w:type="dxa"/>
             <w:tcBorders>
               <w:top w:val="single" w:sz="8" w:space="0" w:color="000000"/>
               <w:bottom w:val="single" w:sz="4" w:space="0" w:color="000000"/>
@@ -7221,7 +7224,6 @@
               <w:keepNext w:val="true"/>
               <w:keepLines w:val="false"/>
               <w:widowControl/>
-              <w:pBdr/>
               <w:shd w:val="clear" w:fill="auto"/>
               <w:spacing w:lineRule="auto" w:line="240" w:before="40" w:after="40"/>
               <w:ind w:hanging="0" w:start="0" w:end="0"/>
@@ -7270,7 +7272,7 @@
         </w:tc>
         <w:tc>
           <w:tcPr>
-            <w:tcW w:w="1091" w:type="dxa"/>
+            <w:tcW w:w="1092" w:type="dxa"/>
             <w:tcBorders>
               <w:top w:val="single" w:sz="8" w:space="0" w:color="000000"/>
               <w:bottom w:val="single" w:sz="4" w:space="0" w:color="000000"/>
@@ -7283,7 +7285,6 @@
               <w:keepNext w:val="true"/>
               <w:keepLines w:val="false"/>
               <w:widowControl/>
-              <w:pBdr/>
               <w:shd w:val="clear" w:fill="auto"/>
               <w:spacing w:lineRule="auto" w:line="240" w:before="40" w:after="40"/>
               <w:ind w:hanging="0" w:start="0" w:end="0"/>
@@ -7337,7 +7338,7 @@
         </w:trPr>
         <w:tc>
           <w:tcPr>
-            <w:tcW w:w="2640" w:type="dxa"/>
+            <w:tcW w:w="2639" w:type="dxa"/>
             <w:tcBorders/>
             <w:vAlign w:val="center"/>
           </w:tcPr>
@@ -7347,7 +7348,6 @@
               <w:keepNext w:val="true"/>
               <w:keepLines w:val="false"/>
               <w:widowControl/>
-              <w:pBdr/>
               <w:shd w:val="clear" w:fill="auto"/>
               <w:spacing w:lineRule="auto" w:line="240" w:before="40" w:after="40"/>
               <w:ind w:hanging="0" w:start="0" w:end="0"/>
@@ -7396,7 +7396,7 @@
         </w:tc>
         <w:tc>
           <w:tcPr>
-            <w:tcW w:w="1264" w:type="dxa"/>
+            <w:tcW w:w="1265" w:type="dxa"/>
             <w:tcBorders/>
             <w:vAlign w:val="center"/>
           </w:tcPr>
@@ -7406,7 +7406,6 @@
               <w:keepNext w:val="true"/>
               <w:keepLines w:val="false"/>
               <w:widowControl/>
-              <w:pBdr/>
               <w:shd w:val="clear" w:fill="auto"/>
               <w:spacing w:lineRule="auto" w:line="240" w:before="40" w:after="40"/>
               <w:ind w:hanging="0" w:start="0" w:end="0"/>
@@ -7465,7 +7464,6 @@
               <w:keepNext w:val="true"/>
               <w:keepLines w:val="false"/>
               <w:widowControl/>
-              <w:pBdr/>
               <w:shd w:val="clear" w:fill="auto"/>
               <w:spacing w:lineRule="auto" w:line="240" w:before="40" w:after="40"/>
               <w:ind w:hanging="0" w:start="0" w:end="0"/>
@@ -7524,7 +7522,6 @@
               <w:keepNext w:val="true"/>
               <w:keepLines w:val="false"/>
               <w:widowControl/>
-              <w:pBdr/>
               <w:shd w:val="clear" w:fill="auto"/>
               <w:spacing w:lineRule="auto" w:line="240" w:before="40" w:after="40"/>
               <w:ind w:hanging="0" w:start="0" w:end="0"/>
@@ -7573,7 +7570,7 @@
         </w:tc>
         <w:tc>
           <w:tcPr>
-            <w:tcW w:w="1205" w:type="dxa"/>
+            <w:tcW w:w="1204" w:type="dxa"/>
             <w:tcBorders/>
             <w:vAlign w:val="center"/>
           </w:tcPr>
@@ -7583,7 +7580,6 @@
               <w:keepNext w:val="true"/>
               <w:keepLines w:val="false"/>
               <w:widowControl/>
-              <w:pBdr/>
               <w:shd w:val="clear" w:fill="auto"/>
               <w:spacing w:lineRule="auto" w:line="240" w:before="40" w:after="40"/>
               <w:ind w:hanging="0" w:start="0" w:end="0"/>
@@ -7632,7 +7628,7 @@
         </w:tc>
         <w:tc>
           <w:tcPr>
-            <w:tcW w:w="1091" w:type="dxa"/>
+            <w:tcW w:w="1092" w:type="dxa"/>
             <w:tcBorders/>
             <w:vAlign w:val="center"/>
           </w:tcPr>
@@ -7642,7 +7638,6 @@
               <w:keepNext w:val="true"/>
               <w:keepLines w:val="false"/>
               <w:widowControl/>
-              <w:pBdr/>
               <w:shd w:val="clear" w:fill="auto"/>
               <w:spacing w:lineRule="auto" w:line="240" w:before="40" w:after="40"/>
               <w:ind w:hanging="0" w:start="0" w:end="0"/>
@@ -7696,7 +7691,7 @@
         </w:trPr>
         <w:tc>
           <w:tcPr>
-            <w:tcW w:w="2640" w:type="dxa"/>
+            <w:tcW w:w="2639" w:type="dxa"/>
             <w:tcBorders>
               <w:bottom w:val="single" w:sz="8" w:space="0" w:color="000000"/>
             </w:tcBorders>
@@ -7708,7 +7703,6 @@
               <w:keepNext w:val="false"/>
               <w:keepLines w:val="false"/>
               <w:widowControl/>
-              <w:pBdr/>
               <w:shd w:val="clear" w:fill="auto"/>
               <w:spacing w:lineRule="auto" w:line="240" w:before="40" w:after="40"/>
               <w:ind w:hanging="0" w:start="0" w:end="0"/>
@@ -7757,7 +7751,7 @@
         </w:tc>
         <w:tc>
           <w:tcPr>
-            <w:tcW w:w="1264" w:type="dxa"/>
+            <w:tcW w:w="1265" w:type="dxa"/>
             <w:tcBorders>
               <w:bottom w:val="single" w:sz="8" w:space="0" w:color="000000"/>
             </w:tcBorders>
@@ -7769,7 +7763,6 @@
               <w:keepNext w:val="false"/>
               <w:keepLines w:val="false"/>
               <w:widowControl/>
-              <w:pBdr/>
               <w:shd w:val="clear" w:fill="auto"/>
               <w:spacing w:lineRule="auto" w:line="240" w:before="40" w:after="40"/>
               <w:ind w:hanging="0" w:start="0" w:end="0"/>
@@ -7830,7 +7823,6 @@
               <w:keepNext w:val="false"/>
               <w:keepLines w:val="false"/>
               <w:widowControl/>
-              <w:pBdr/>
               <w:shd w:val="clear" w:fill="auto"/>
               <w:spacing w:lineRule="auto" w:line="240" w:before="40" w:after="40"/>
               <w:ind w:hanging="0" w:start="0" w:end="0"/>
@@ -7891,7 +7883,6 @@
               <w:keepNext w:val="false"/>
               <w:keepLines w:val="false"/>
               <w:widowControl/>
-              <w:pBdr/>
               <w:shd w:val="clear" w:fill="auto"/>
               <w:spacing w:lineRule="auto" w:line="240" w:before="40" w:after="40"/>
               <w:ind w:hanging="0" w:start="0" w:end="0"/>
@@ -7940,7 +7931,7 @@
         </w:tc>
         <w:tc>
           <w:tcPr>
-            <w:tcW w:w="1205" w:type="dxa"/>
+            <w:tcW w:w="1204" w:type="dxa"/>
             <w:tcBorders>
               <w:bottom w:val="single" w:sz="8" w:space="0" w:color="000000"/>
             </w:tcBorders>
@@ -7952,7 +7943,6 @@
               <w:keepNext w:val="false"/>
               <w:keepLines w:val="false"/>
               <w:widowControl/>
-              <w:pBdr/>
               <w:shd w:val="clear" w:fill="auto"/>
               <w:spacing w:lineRule="auto" w:line="240" w:before="40" w:after="40"/>
               <w:ind w:hanging="0" w:start="0" w:end="0"/>
@@ -8001,7 +7991,7 @@
         </w:tc>
         <w:tc>
           <w:tcPr>
-            <w:tcW w:w="1091" w:type="dxa"/>
+            <w:tcW w:w="1092" w:type="dxa"/>
             <w:tcBorders>
               <w:bottom w:val="single" w:sz="8" w:space="0" w:color="000000"/>
             </w:tcBorders>
@@ -8013,7 +8003,6 @@
               <w:keepNext w:val="false"/>
               <w:keepLines w:val="false"/>
               <w:widowControl/>
-              <w:pBdr/>
               <w:shd w:val="clear" w:fill="auto"/>
               <w:spacing w:lineRule="auto" w:line="240" w:before="40" w:after="40"/>
               <w:ind w:hanging="0" w:start="0" w:end="0"/>
@@ -8069,7 +8058,6 @@
         <w:keepLines w:val="false"/>
         <w:pageBreakBefore w:val="false"/>
         <w:widowControl/>
-        <w:pBdr/>
         <w:shd w:val="clear" w:fill="auto"/>
         <w:spacing w:lineRule="auto" w:line="240" w:before="60" w:after="240"/>
         <w:ind w:hanging="0" w:start="0" w:end="0"/>
@@ -8094,7 +8082,24 @@
         </w:rPr>
       </w:pPr>
       <w:r>
-        <w:rPr/>
+        <w:rPr>
+          <w:rFonts w:eastAsia="Times New Roman" w:cs="Times New Roman"/>
+          <w:b w:val="false"/>
+          <w:bCs w:val="false"/>
+          <w:i w:val="false"/>
+          <w:iCs w:val="false"/>
+          <w:caps w:val="false"/>
+          <w:smallCaps w:val="false"/>
+          <w:strike w:val="false"/>
+          <w:dstrike w:val="false"/>
+          <w:color w:val="000000"/>
+          <w:position w:val="0"/>
+          <w:sz w:val="20"/>
+          <w:szCs w:val="20"/>
+          <w:u w:val="none"/>
+          <w:shd w:fill="auto" w:val="clear"/>
+          <w:vertAlign w:val="baseline"/>
+        </w:rPr>
       </w:r>
     </w:p>
     <w:p>
@@ -8113,7 +8118,6 @@
         <w:keepLines/>
         <w:pageBreakBefore w:val="false"/>
         <w:widowControl/>
-        <w:pBdr/>
         <w:shd w:val="clear" w:fill="auto"/>
         <w:spacing w:lineRule="auto" w:line="240" w:before="240" w:after="120"/>
         <w:ind w:hanging="0" w:start="0" w:end="0"/>
@@ -8166,7 +8170,6 @@
         <w:keepLines w:val="false"/>
         <w:pageBreakBefore w:val="false"/>
         <w:widowControl/>
-        <w:pBdr/>
         <w:shd w:val="clear" w:fill="auto"/>
         <w:spacing w:lineRule="auto" w:line="240" w:before="0" w:after="60"/>
         <w:ind w:hanging="0" w:start="0" w:end="0"/>
@@ -8239,7 +8242,6 @@
         <w:keepLines w:val="false"/>
         <w:pageBreakBefore w:val="false"/>
         <w:widowControl/>
-        <w:pBdr/>
         <w:shd w:val="clear" w:fill="auto"/>
         <w:spacing w:lineRule="auto" w:line="240" w:before="60" w:after="240"/>
         <w:ind w:hanging="0" w:start="0" w:end="0"/>
@@ -8264,7 +8266,24 @@
         </w:rPr>
       </w:pPr>
       <w:r>
-        <w:rPr/>
+        <w:rPr>
+          <w:rFonts w:eastAsia="Times New Roman" w:cs="Times New Roman"/>
+          <w:b w:val="false"/>
+          <w:bCs w:val="false"/>
+          <w:i w:val="false"/>
+          <w:iCs w:val="false"/>
+          <w:caps w:val="false"/>
+          <w:smallCaps w:val="false"/>
+          <w:strike w:val="false"/>
+          <w:dstrike w:val="false"/>
+          <w:color w:val="000000"/>
+          <w:position w:val="0"/>
+          <w:sz w:val="20"/>
+          <w:szCs w:val="20"/>
+          <w:u w:val="none"/>
+          <w:shd w:fill="auto" w:val="clear"/>
+          <w:vertAlign w:val="baseline"/>
+        </w:rPr>
       </w:r>
     </w:p>
     <w:p>
@@ -8274,7 +8293,6 @@
         <w:keepLines/>
         <w:pageBreakBefore w:val="false"/>
         <w:widowControl/>
-        <w:pBdr/>
         <w:shd w:val="clear" w:fill="auto"/>
         <w:spacing w:lineRule="auto" w:line="240" w:before="240" w:after="120"/>
         <w:ind w:hanging="0" w:start="0" w:end="0"/>
@@ -8327,7 +8345,6 @@
         <w:keepLines w:val="false"/>
         <w:pageBreakBefore w:val="false"/>
         <w:widowControl/>
-        <w:pBdr/>
         <w:shd w:val="clear" w:fill="auto"/>
         <w:spacing w:lineRule="auto" w:line="240" w:before="0" w:after="60"/>
         <w:ind w:hanging="0" w:start="0" w:end="0"/>
@@ -8400,7 +8417,6 @@
         <w:keepLines w:val="false"/>
         <w:pageBreakBefore w:val="false"/>
         <w:widowControl/>
-        <w:pBdr/>
         <w:shd w:val="clear" w:fill="auto"/>
         <w:spacing w:lineRule="auto" w:line="240" w:before="60" w:after="240"/>
         <w:ind w:hanging="0" w:start="0" w:end="0"/>
@@ -8425,7 +8441,24 @@
         </w:rPr>
       </w:pPr>
       <w:r>
-        <w:rPr/>
+        <w:rPr>
+          <w:rFonts w:eastAsia="Times New Roman" w:cs="Times New Roman"/>
+          <w:b w:val="false"/>
+          <w:bCs w:val="false"/>
+          <w:i w:val="false"/>
+          <w:iCs w:val="false"/>
+          <w:caps w:val="false"/>
+          <w:smallCaps w:val="false"/>
+          <w:strike w:val="false"/>
+          <w:dstrike w:val="false"/>
+          <w:color w:val="000000"/>
+          <w:position w:val="0"/>
+          <w:sz w:val="20"/>
+          <w:szCs w:val="20"/>
+          <w:u w:val="none"/>
+          <w:shd w:fill="auto" w:val="clear"/>
+          <w:vertAlign w:val="baseline"/>
+        </w:rPr>
       </w:r>
     </w:p>
     <w:p>
@@ -8455,7 +8488,6 @@
         <w:keepLines/>
         <w:pageBreakBefore w:val="false"/>
         <w:widowControl/>
-        <w:pBdr/>
         <w:shd w:val="clear" w:fill="auto"/>
         <w:spacing w:lineRule="auto" w:line="240" w:before="240" w:after="120"/>
         <w:ind w:hanging="0" w:start="0" w:end="0"/>
@@ -8508,7 +8540,6 @@
         <w:keepLines w:val="false"/>
         <w:pageBreakBefore w:val="false"/>
         <w:widowControl/>
-        <w:pBdr/>
         <w:shd w:val="clear" w:fill="auto"/>
         <w:spacing w:lineRule="auto" w:line="240" w:before="0" w:after="60"/>
         <w:ind w:hanging="0" w:start="0" w:end="0"/>
@@ -8581,7 +8612,6 @@
         <w:keepLines w:val="false"/>
         <w:pageBreakBefore w:val="false"/>
         <w:widowControl/>
-        <w:pBdr/>
         <w:shd w:val="clear" w:fill="auto"/>
         <w:spacing w:lineRule="auto" w:line="240" w:before="60" w:after="240"/>
         <w:ind w:hanging="0" w:start="0" w:end="0"/>
@@ -8606,7 +8636,24 @@
         </w:rPr>
       </w:pPr>
       <w:r>
-        <w:rPr/>
+        <w:rPr>
+          <w:rFonts w:eastAsia="Times New Roman" w:cs="Times New Roman"/>
+          <w:b w:val="false"/>
+          <w:bCs w:val="false"/>
+          <w:i w:val="false"/>
+          <w:iCs w:val="false"/>
+          <w:caps w:val="false"/>
+          <w:smallCaps w:val="false"/>
+          <w:strike w:val="false"/>
+          <w:dstrike w:val="false"/>
+          <w:color w:val="000000"/>
+          <w:position w:val="0"/>
+          <w:sz w:val="20"/>
+          <w:szCs w:val="20"/>
+          <w:u w:val="none"/>
+          <w:shd w:fill="auto" w:val="clear"/>
+          <w:vertAlign w:val="baseline"/>
+        </w:rPr>
       </w:r>
     </w:p>
     <w:p>
@@ -8662,7 +8709,6 @@
           <w:ilvl w:val="0"/>
           <w:numId w:val="2"/>
         </w:numPr>
-        <w:pBdr/>
         <w:shd w:val="clear" w:fill="auto"/>
         <w:spacing w:lineRule="auto" w:line="360" w:before="0" w:after="0"/>
         <w:ind w:hanging="567" w:start="1134" w:end="0"/>
@@ -8723,7 +8769,6 @@
           <w:ilvl w:val="0"/>
           <w:numId w:val="2"/>
         </w:numPr>
-        <w:pBdr/>
         <w:shd w:val="clear" w:fill="auto"/>
         <w:spacing w:lineRule="auto" w:line="360" w:before="0" w:after="0"/>
         <w:ind w:hanging="567" w:start="1134" w:end="0"/>
@@ -8784,7 +8829,6 @@
           <w:ilvl w:val="0"/>
           <w:numId w:val="2"/>
         </w:numPr>
-        <w:pBdr/>
         <w:shd w:val="clear" w:fill="auto"/>
         <w:spacing w:lineRule="auto" w:line="360" w:before="0" w:after="0"/>
         <w:ind w:hanging="567" w:start="1134" w:end="0"/>
@@ -8845,7 +8889,6 @@
           <w:ilvl w:val="0"/>
           <w:numId w:val="2"/>
         </w:numPr>
-        <w:pBdr/>
         <w:shd w:val="clear" w:fill="auto"/>
         <w:spacing w:lineRule="auto" w:line="360" w:before="0" w:after="0"/>
         <w:ind w:hanging="567" w:start="1134" w:end="0"/>
@@ -8906,7 +8949,6 @@
           <w:ilvl w:val="0"/>
           <w:numId w:val="2"/>
         </w:numPr>
-        <w:pBdr/>
         <w:shd w:val="clear" w:fill="auto"/>
         <w:spacing w:lineRule="auto" w:line="360" w:before="0" w:after="0"/>
         <w:ind w:hanging="567" w:start="1134" w:end="0"/>
@@ -8967,7 +9009,6 @@
           <w:ilvl w:val="0"/>
           <w:numId w:val="2"/>
         </w:numPr>
-        <w:pBdr/>
         <w:shd w:val="clear" w:fill="auto"/>
         <w:spacing w:lineRule="auto" w:line="360" w:before="0" w:after="0"/>
         <w:ind w:hanging="567" w:start="1134" w:end="0"/>
@@ -9049,14 +9090,7 @@
           <w:b/>
           <w:bCs/>
         </w:rPr>
-        <w:t xml:space="preserve">o médico deve sempre ter a palavra final no diagnóstico, </w:t>
-      </w:r>
-      <w:r>
-        <w:rPr>
-          <w:b/>
-          <w:bCs/>
-        </w:rPr>
-        <w:t>principalmente pelos resultados apresentarem a pequena probabilidade de falso negativo.</w:t>
+        <w:t>o médico deve sempre ter a palavra final no diagnóstico, principalmente pelos resultados apresentarem a pequena probabilidade de falso negativo.</w:t>
       </w:r>
       <w:r>
         <w:rPr/>
@@ -9122,7 +9156,6 @@
       <w:keepLines w:val="false"/>
       <w:pageBreakBefore w:val="false"/>
       <w:widowControl/>
-      <w:pBdr/>
       <w:shd w:val="clear" w:fill="auto"/>
       <w:tabs>
         <w:tab w:val="clear" w:pos="720"/>
@@ -9165,7 +9198,7 @@
     </w:r>
     <w:r>
       <w:rPr/>
-      <w:t>14</w:t>
+      <w:t>16</w:t>
     </w:r>
     <w:r>
       <w:rPr/>
@@ -9184,7 +9217,6 @@
       <w:keepLines w:val="false"/>
       <w:pageBreakBefore w:val="false"/>
       <w:widowControl/>
-      <w:pBdr/>
       <w:shd w:val="clear" w:fill="auto"/>
       <w:tabs>
         <w:tab w:val="clear" w:pos="720"/>
@@ -9227,7 +9259,7 @@
     </w:r>
     <w:r>
       <w:rPr/>
-      <w:t>14</w:t>
+      <w:t>16</w:t>
     </w:r>
     <w:r>
       <w:rPr/>
@@ -9661,6 +9693,7 @@
     <w:name w:val="Normal"/>
     <w:pPr>
       <w:widowControl/>
+      <w:suppressAutoHyphens w:val="true"/>
       <w:bidi w:val="0"/>
       <w:spacing w:lineRule="auto" w:line="360" w:before="0" w:after="0"/>
       <w:ind w:firstLine="709"/>
@@ -9831,10 +9864,35 @@
       <w:rFonts w:cs="Arial"/>
     </w:rPr>
   </w:style>
+  <w:style w:type="paragraph" w:styleId="Ttulouser">
+    <w:name w:val="Título (user)"/>
+    <w:basedOn w:val="Normal"/>
+    <w:next w:val="BodyText"/>
+    <w:pPr>
+      <w:keepNext w:val="true"/>
+      <w:spacing w:before="240" w:after="120"/>
+    </w:pPr>
+    <w:rPr>
+      <w:rFonts w:ascii="Liberation Sans" w:hAnsi="Liberation Sans" w:eastAsia="Microsoft YaHei" w:cs="Arial"/>
+      <w:sz w:val="28"/>
+      <w:szCs w:val="28"/>
+    </w:rPr>
+  </w:style>
+  <w:style w:type="paragraph" w:styleId="ndiceuser">
+    <w:name w:val="Índice (user)"/>
+    <w:basedOn w:val="Normal"/>
+    <w:pPr>
+      <w:suppressLineNumbers/>
+    </w:pPr>
+    <w:rPr>
+      <w:rFonts w:cs="Arial"/>
+    </w:rPr>
+  </w:style>
   <w:style w:type="paragraph" w:styleId="normal1" w:default="1">
     <w:name w:val="normal1"/>
     <w:pPr>
       <w:widowControl/>
+      <w:suppressAutoHyphens w:val="true"/>
       <w:bidi w:val="0"/>
       <w:spacing w:lineRule="auto" w:line="360" w:before="0" w:after="0"/>
       <w:ind w:firstLine="709"/>
@@ -9885,6 +9943,12 @@
       <w:szCs w:val="48"/>
     </w:rPr>
   </w:style>
+  <w:style w:type="paragraph" w:styleId="Cabealhoerodapuser">
+    <w:name w:val="Cabeçalho e rodapé (user)"/>
+    <w:basedOn w:val="Normal"/>
+    <w:pPr/>
+    <w:rPr/>
+  </w:style>
   <w:style w:type="paragraph" w:styleId="Cabealhoerodap">
     <w:name w:val="Cabeçalho e rodapé"/>
     <w:basedOn w:val="Normal"/>
@@ -9893,7 +9957,7 @@
   </w:style>
   <w:style w:type="paragraph" w:styleId="Header">
     <w:name w:val="header"/>
-    <w:basedOn w:val="Cabealhoerodap"/>
+    <w:basedOn w:val="Cabealhoerodapuser"/>
     <w:pPr/>
     <w:rPr/>
   </w:style>

</xml_diff>

<commit_message>
atualização de links do colab para execução adicional
</commit_message>
<xml_diff>
--- a/Relatorio_Tecnico_Tech_Challenge_Fase1_v1.docx
+++ b/Relatorio_Tecnico_Tech_Challenge_Fase1_v1.docx
@@ -2236,7 +2236,7 @@
     <w:tbl>
       <w:tblPr>
         <w:tblStyle w:val="Table1"/>
-        <w:tblW w:w="9071" w:type="dxa"/>
+        <w:tblW w:w="8950" w:type="dxa"/>
         <w:jc w:val="center"/>
         <w:tblInd w:w="0" w:type="dxa"/>
         <w:tblLayout w:type="fixed"/>
@@ -2249,8 +2249,8 @@
         <w:tblLook w:val="0000"/>
       </w:tblPr>
       <w:tblGrid>
-        <w:gridCol w:w="2607"/>
-        <w:gridCol w:w="6464"/>
+        <w:gridCol w:w="2490"/>
+        <w:gridCol w:w="6460"/>
       </w:tblGrid>
       <w:tr>
         <w:trPr>
@@ -2258,7 +2258,7 @@
         </w:trPr>
         <w:tc>
           <w:tcPr>
-            <w:tcW w:w="2607" w:type="dxa"/>
+            <w:tcW w:w="2490" w:type="dxa"/>
             <w:tcBorders>
               <w:top w:val="single" w:sz="4" w:space="0" w:color="000000"/>
               <w:start w:val="single" w:sz="4" w:space="0" w:color="000000"/>
@@ -2321,7 +2321,7 @@
         </w:tc>
         <w:tc>
           <w:tcPr>
-            <w:tcW w:w="6464" w:type="dxa"/>
+            <w:tcW w:w="6460" w:type="dxa"/>
             <w:tcBorders>
               <w:top w:val="single" w:sz="4" w:space="0" w:color="000000"/>
               <w:start w:val="single" w:sz="4" w:space="0" w:color="000000"/>
@@ -2389,7 +2389,7 @@
         </w:trPr>
         <w:tc>
           <w:tcPr>
-            <w:tcW w:w="2607" w:type="dxa"/>
+            <w:tcW w:w="2490" w:type="dxa"/>
             <w:tcBorders>
               <w:top w:val="single" w:sz="4" w:space="0" w:color="000000"/>
               <w:start w:val="single" w:sz="4" w:space="0" w:color="000000"/>
@@ -2452,7 +2452,7 @@
         </w:tc>
         <w:tc>
           <w:tcPr>
-            <w:tcW w:w="6464" w:type="dxa"/>
+            <w:tcW w:w="6460" w:type="dxa"/>
             <w:tcBorders>
               <w:top w:val="single" w:sz="4" w:space="0" w:color="000000"/>
               <w:start w:val="single" w:sz="4" w:space="0" w:color="000000"/>
@@ -2520,7 +2520,7 @@
         </w:trPr>
         <w:tc>
           <w:tcPr>
-            <w:tcW w:w="2607" w:type="dxa"/>
+            <w:tcW w:w="2490" w:type="dxa"/>
             <w:tcBorders>
               <w:top w:val="single" w:sz="4" w:space="0" w:color="000000"/>
               <w:start w:val="single" w:sz="4" w:space="0" w:color="000000"/>
@@ -2583,7 +2583,7 @@
         </w:tc>
         <w:tc>
           <w:tcPr>
-            <w:tcW w:w="6464" w:type="dxa"/>
+            <w:tcW w:w="6460" w:type="dxa"/>
             <w:tcBorders>
               <w:top w:val="single" w:sz="4" w:space="0" w:color="000000"/>
               <w:start w:val="single" w:sz="4" w:space="0" w:color="000000"/>
@@ -2651,7 +2651,7 @@
         </w:trPr>
         <w:tc>
           <w:tcPr>
-            <w:tcW w:w="2607" w:type="dxa"/>
+            <w:tcW w:w="2490" w:type="dxa"/>
             <w:tcBorders>
               <w:top w:val="single" w:sz="4" w:space="0" w:color="000000"/>
               <w:start w:val="single" w:sz="4" w:space="0" w:color="000000"/>
@@ -2672,8 +2672,8 @@
               <w:jc w:val="start"/>
               <w:rPr>
                 <w:rFonts w:ascii="Times New Roman" w:hAnsi="Times New Roman" w:eastAsia="Times New Roman" w:cs="Times New Roman"/>
-                <w:b w:val="false"/>
-                <w:bCs w:val="false"/>
+                <w:b/>
+                <w:bCs/>
                 <w:i w:val="false"/>
                 <w:iCs w:val="false"/>
                 <w:caps w:val="false"/>
@@ -2708,15 +2708,83 @@
                 <w:shd w:fill="auto" w:val="clear"/>
                 <w:vertAlign w:val="baseline"/>
               </w:rPr>
-              <w:t>Repositório Git</w:t>
+              <w:t>Link COLAB</w:t>
             </w:r>
           </w:p>
         </w:tc>
         <w:tc>
           <w:tcPr>
-            <w:tcW w:w="6464" w:type="dxa"/>
+            <w:tcW w:w="6460" w:type="dxa"/>
             <w:tcBorders>
               <w:top w:val="single" w:sz="4" w:space="0" w:color="000000"/>
+              <w:start w:val="single" w:sz="4" w:space="0" w:color="000000"/>
+              <w:bottom w:val="single" w:sz="4" w:space="0" w:color="000000"/>
+              <w:end w:val="single" w:sz="4" w:space="0" w:color="000000"/>
+            </w:tcBorders>
+            <w:vAlign w:val="center"/>
+          </w:tcPr>
+          <w:p>
+            <w:pPr>
+              <w:pStyle w:val="normal1"/>
+              <w:keepNext w:val="true"/>
+              <w:keepLines w:val="false"/>
+              <w:widowControl/>
+              <w:shd w:val="clear" w:fill="auto"/>
+              <w:bidi w:val="0"/>
+              <w:spacing w:lineRule="auto" w:line="240" w:before="40" w:after="40"/>
+              <w:ind w:hanging="0" w:start="0" w:end="0"/>
+              <w:jc w:val="start"/>
+              <w:rPr>
+                <w:rFonts w:ascii="Times New Roman" w:hAnsi="Times New Roman" w:eastAsia="Times New Roman" w:cs="Times New Roman"/>
+                <w:b w:val="false"/>
+                <w:bCs w:val="false"/>
+                <w:i w:val="false"/>
+                <w:iCs w:val="false"/>
+                <w:caps w:val="false"/>
+                <w:smallCaps w:val="false"/>
+                <w:strike w:val="false"/>
+                <w:dstrike w:val="false"/>
+                <w:color w:val="000000"/>
+                <w:position w:val="0"/>
+                <w:sz w:val="20"/>
+                <w:szCs w:val="20"/>
+                <w:u w:val="none"/>
+                <w:shd w:fill="auto" w:val="clear"/>
+                <w:vertAlign w:val="baseline"/>
+              </w:rPr>
+            </w:pPr>
+            <w:r>
+              <w:rPr>
+                <w:rFonts w:eastAsia="Times New Roman" w:cs="Times New Roman"/>
+                <w:b w:val="false"/>
+                <w:bCs w:val="false"/>
+                <w:i w:val="false"/>
+                <w:iCs w:val="false"/>
+                <w:caps w:val="false"/>
+                <w:smallCaps w:val="false"/>
+                <w:strike w:val="false"/>
+                <w:dstrike w:val="false"/>
+                <w:color w:val="000000"/>
+                <w:position w:val="0"/>
+                <w:sz w:val="20"/>
+                <w:szCs w:val="20"/>
+                <w:u w:val="none"/>
+                <w:shd w:fill="auto" w:val="clear"/>
+                <w:vertAlign w:val="baseline"/>
+              </w:rPr>
+              <w:t>https://colab.research.google.com/drive/1GL6NSUKcgPTa72Q3Nir3c4PeFhADeiqv?usp=sharing</w:t>
+            </w:r>
+          </w:p>
+        </w:tc>
+      </w:tr>
+      <w:tr>
+        <w:trPr>
+          <w:cantSplit/>
+        </w:trPr>
+        <w:tc>
+          <w:tcPr>
+            <w:tcW w:w="2490" w:type="dxa"/>
+            <w:tcBorders>
               <w:start w:val="single" w:sz="4" w:space="0" w:color="000000"/>
               <w:bottom w:val="single" w:sz="4" w:space="0" w:color="000000"/>
               <w:end w:val="single" w:sz="4" w:space="0" w:color="000000"/>
@@ -2755,6 +2823,68 @@
             <w:r>
               <w:rPr>
                 <w:rFonts w:eastAsia="Times New Roman" w:cs="Times New Roman"/>
+                <w:b/>
+                <w:bCs/>
+                <w:i w:val="false"/>
+                <w:iCs w:val="false"/>
+                <w:caps w:val="false"/>
+                <w:smallCaps w:val="false"/>
+                <w:strike w:val="false"/>
+                <w:dstrike w:val="false"/>
+                <w:color w:val="000000"/>
+                <w:position w:val="0"/>
+                <w:sz w:val="20"/>
+                <w:szCs w:val="20"/>
+                <w:u w:val="none"/>
+                <w:shd w:fill="auto" w:val="clear"/>
+                <w:vertAlign w:val="baseline"/>
+              </w:rPr>
+              <w:t>Repositório Git</w:t>
+            </w:r>
+          </w:p>
+        </w:tc>
+        <w:tc>
+          <w:tcPr>
+            <w:tcW w:w="6460" w:type="dxa"/>
+            <w:tcBorders>
+              <w:start w:val="single" w:sz="4" w:space="0" w:color="000000"/>
+              <w:bottom w:val="single" w:sz="4" w:space="0" w:color="000000"/>
+              <w:end w:val="single" w:sz="4" w:space="0" w:color="000000"/>
+            </w:tcBorders>
+            <w:vAlign w:val="center"/>
+          </w:tcPr>
+          <w:p>
+            <w:pPr>
+              <w:pStyle w:val="normal1"/>
+              <w:keepNext w:val="true"/>
+              <w:keepLines w:val="false"/>
+              <w:widowControl/>
+              <w:shd w:val="clear" w:fill="auto"/>
+              <w:spacing w:lineRule="auto" w:line="240" w:before="40" w:after="40"/>
+              <w:ind w:hanging="0" w:start="0" w:end="0"/>
+              <w:jc w:val="start"/>
+              <w:rPr>
+                <w:rFonts w:ascii="Times New Roman" w:hAnsi="Times New Roman" w:eastAsia="Times New Roman" w:cs="Times New Roman"/>
+                <w:b w:val="false"/>
+                <w:bCs w:val="false"/>
+                <w:i w:val="false"/>
+                <w:iCs w:val="false"/>
+                <w:caps w:val="false"/>
+                <w:smallCaps w:val="false"/>
+                <w:strike w:val="false"/>
+                <w:dstrike w:val="false"/>
+                <w:color w:val="000000"/>
+                <w:position w:val="0"/>
+                <w:sz w:val="20"/>
+                <w:szCs w:val="20"/>
+                <w:u w:val="none"/>
+                <w:shd w:fill="auto" w:val="clear"/>
+                <w:vertAlign w:val="baseline"/>
+              </w:rPr>
+            </w:pPr>
+            <w:r>
+              <w:rPr>
+                <w:rFonts w:eastAsia="Times New Roman" w:cs="Times New Roman"/>
                 <w:b w:val="false"/>
                 <w:bCs w:val="false"/>
                 <w:i w:val="false"/>
@@ -2782,7 +2912,7 @@
         </w:trPr>
         <w:tc>
           <w:tcPr>
-            <w:tcW w:w="2607" w:type="dxa"/>
+            <w:tcW w:w="2490" w:type="dxa"/>
             <w:tcBorders>
               <w:top w:val="single" w:sz="4" w:space="0" w:color="000000"/>
               <w:start w:val="single" w:sz="4" w:space="0" w:color="000000"/>
@@ -2845,7 +2975,7 @@
         </w:tc>
         <w:tc>
           <w:tcPr>
-            <w:tcW w:w="6464" w:type="dxa"/>
+            <w:tcW w:w="6460" w:type="dxa"/>
             <w:tcBorders>
               <w:top w:val="single" w:sz="4" w:space="0" w:color="000000"/>
               <w:start w:val="single" w:sz="4" w:space="0" w:color="000000"/>
@@ -9198,7 +9328,7 @@
     </w:r>
     <w:r>
       <w:rPr/>
-      <w:t>16</w:t>
+      <w:t>5</w:t>
     </w:r>
     <w:r>
       <w:rPr/>
@@ -9259,7 +9389,7 @@
     </w:r>
     <w:r>
       <w:rPr/>
-      <w:t>16</w:t>
+      <w:t>5</w:t>
     </w:r>
     <w:r>
       <w:rPr/>

</xml_diff>